<commit_message>
Worksheets: embed 160 missing images into 31 .docx files
The .docx files in content/CP*/ stored images as External r:link
references (file:///C:\Users\JohnD\...\Media\foo.jpg), so mammoth in
the browser had nothing to follow and the course showed blank images.

Ran the splitter's embed step against each .docx in lms/content/CP*/:
- looked up each referenced filename in assets/<COURSE>/Media/
- read the bytes, added them to word/media/<safe-name>
- rewrote each rel from External file:/// → Internal media/<name>
- promoted document.xml r:link → r:embed for those rIds
- added the matching <Default> content-types for new extensions

Result: 36 docs scanned, 31 touched, 160 images embedded, 11 unresolved.

Unresolved: 11 references to 'PIC development centre.png' across
CP1972-*. That filename isn't in assets/CP1972/Media — drop the real
file into that folder and re-run tools-fix-docx-images.js to close
the last 11. Everything else now renders images in the viewer.
</commit_message>
<xml_diff>
--- a/content/CP0507/CP0507-1.docx
+++ b/content/CP0507/CP0507-1.docx
@@ -265,7 +265,7 @@
                           <pic:cNvPicPr/>
                         </pic:nvPicPr>
                         <pic:blipFill>
-                          <a:blip r:link="rId10"/>
+                          <a:blip r:embed="rId10"/>
                           <a:stretch>
                             <a:fillRect/>
                           </a:stretch>
@@ -388,7 +388,7 @@
                     <pic:cNvPicPr/>
                   </pic:nvPicPr>
                   <pic:blipFill>
-                    <a:blip r:link="rId11"/>
+                    <a:blip r:embed="rId11"/>
                     <a:stretch>
                       <a:fillRect/>
                     </a:stretch>
@@ -441,7 +441,7 @@
                     <pic:cNvPicPr/>
                   </pic:nvPicPr>
                   <pic:blipFill>
-                    <a:blip r:link="rId12"/>
+                    <a:blip r:embed="rId12"/>
                     <a:stretch>
                       <a:fillRect/>
                     </a:stretch>

</xml_diff>